<commit_message>
test: adiciona suite de testes TDD com pytest e atualiza artigo
</commit_message>
<xml_diff>
--- a/Simulação da Propagação em Plantação de Uvas por Autômatos Celulares em Ambiente Python.docx
+++ b/Simulação da Propagação em Plantação de Uvas por Autômatos Celulares em Ambiente Python.docx
@@ -183,7 +183,7 @@
           <w:rFonts w:ascii="Times" w:cs="Times" w:eastAsia="Times" w:hAnsi="Times"/>
           <w:i w:val="1"/>
         </w:rPr>
-        <w:t xml:space="preserve">O controle fitossanitário em vinhedos representa um dos desafios mais complexos para a viticultura contemporânea. A modelagem computacional in silico tem se consolidado como uma ferramenta essencial para a compreensão dos mecanismos de disseminação fitopatogênica e da contenção de pragas agrícolas. Este trabalho apresenta o desenvolvimento de um modelo computacional baseado em Autômatos Celulares (AC), implementado na linguagem Python, para analisar a dinâmica de contágio e propagação espacial de uma parreira contaminada sobre uma plantação de parreiras sadias e sua posterior recuperação atuando como barreira de contenção. A simulação foi executada ao longo de 50 ciclos temporais, modelando as transições de estado, a mecânica da vizinhança espacial de Moore e o impacto do tempo de recuperação das parreiras na formação da barreira. Os resultados incluem a análise quantitativa da curva epidemiológica e relatórios em formato .txt adaptados para acessibilidade via leitores de tela.</w:t>
+        <w:t xml:space="preserve">O controle fitossanitário em vinhedos representa um dos desafios mais complexos para a viticultura contemporânea. A modelagem computacional in silico tem se consolidado como uma ferramenta essencial para a compreensão dos mecanismos de disseminação fitopatogênica e da contenção de pragas agrícolas. Este trabalho apresenta o desenvolvimento de um modelo computacional baseado em Autômatos Celulares (AC), implementado na linguagem Python com desenvolvimento orientado a testes (TDD via Pytest), para analisar a dinâmica de contágio e propagação espacial de uma parreira contaminada sobre uma plantação de parreiras sadias e sua posterior recuperação atuando como barreira de contenção. A simulação foi executada ao longo de 50 ciclos temporais, modelando as transições de estado, a mecânica da vizinhança espacial de Moore e o impacto do tempo de recuperação das parreiras na formação da barreira. Os resultados incluem a análise quantitativa da curva epidemiológica, verificação automatizada por testes unitários e relatórios em formato .txt adaptados para acessibilidade via leitores de tela.</w:t>
       </w:r>
     </w:p>
     <w:p>
@@ -280,7 +280,7 @@
           <w:rtl w:val="0"/>
         </w:rPr>
         <w:tab/>
-        <w:t xml:space="preserve">O modelo foi construído em Python e utiliza matrizes bidimensionais (biblioteca NumPy e visualização com Matplotlib/Tkinter) para representar a estrutura espacial da plantação de uvas. A grade espacial é definida como um reticulado discreto de dimensões 50 x 50.</w:t>
+        <w:t xml:space="preserve">O modelo foi construído em Python seguindo práticas de Desenvolvimento Orientado a Testes (TDD com o framework Pytest) e utiliza matrizes bidimensionais (biblioteca NumPy e visualização com Matplotlib/Tkinter) para representar a estrutura espacial da plantação de uvas. A grade espacial é definida como um reticulado discreto de dimensões 50 x 50.</w:t>
       </w:r>
     </w:p>
     <w:p>
@@ -402,7 +402,7 @@
           <w:rtl w:val="0"/>
         </w:rPr>
         <w:tab/>
-        <w:t xml:space="preserve">Para avaliar a estabilidade do modelo computacional e a dinâmica de propagação do contágio e formação de barreira na plantação de uvas, foram executadas três replicações independentes da simulação sob as mesmas condições iniciais, durante um horizonte temporal fixado em T = 50 ciclos.</w:t>
+        <w:t xml:space="preserve">Para avaliar a estabilidade do modelo computacional, a invariância das regras verificadas via TDD (Pytest) e a dinâmica de propagação do contágio e formação de barreira na plantação de uvas, foram executadas três replicações independentes da simulação sob as mesmas condições iniciais, durante um horizonte temporal fixado em T = 50 ciclos.</w:t>
       </w:r>
     </w:p>
     <w:p>
@@ -1081,7 +1081,7 @@
         <w:rPr>
           <w:rtl w:val="0"/>
         </w:rPr>
-        <w:t xml:space="preserve">O modelo desenvolvido em Python demonstrou eficácia ao representar a dinâmica de contaminação entre parreiras de uva e sua posterior recuperação atuando como barreira de contenção por meio da abordagem de Autômatos Celulares baseada na topologia de Moore. A consistência observada nas replicações experimentais confirma que a transição para o estado recuperado/barreira limita significativamente a expansão da praga no vinhedo, delimitando a duração da fase infecciosa ao intervalo entre 21 e 24 ciclos.</w:t>
+        <w:t xml:space="preserve">O modelo desenvolvido em Python e validado por testes automatizados em TDD (Pytest) demonstrou eficácia ao representar a dinâmica de contaminação entre parreiras de uva e sua posterior recuperação atuando como barreira de contenção por meio da abordagem de Autômatos Celulares baseada na topologia de Moore. A consistência observada nas replicações experimentais confirma que a transição para o estado recuperado/barreira limita significativamente a expansão da praga no vinhedo, delimitando a duração da fase infecciosa ao intervalo entre 21 e 24 ciclos.</w:t>
       </w:r>
     </w:p>
     <w:p>

</xml_diff>

<commit_message>
docs: gera artigo 100% limpo sem simbolos * ou # com base no arquivo Simulacao de C:\jones
</commit_message>
<xml_diff>
--- a/Simulação da Propagação em Plantação de Uvas por Autômatos Celulares em Ambiente Python.docx
+++ b/Simulação da Propagação em Plantação de Uvas por Autômatos Celulares em Ambiente Python.docx
@@ -183,7 +183,7 @@
           <w:rFonts w:ascii="Times" w:cs="Times" w:eastAsia="Times" w:hAnsi="Times"/>
           <w:i w:val="1"/>
         </w:rPr>
-        <w:t xml:space="preserve">O controle fitossanitário em vinhedos representa um dos desafios mais complexos para a viticultura contemporânea. A modelagem computacional in silico tem se consolidado como uma ferramenta essencial para a compreensão dos mecanismos de disseminação fitopatogênica e da contenção de pragas agrícolas. Este trabalho apresenta o desenvolvimento de um modelo computacional baseado em Autômatos Celulares (AC), implementado na linguagem Python com desenvolvimento orientado a testes (TDD via Pytest), para analisar a dinâmica de contágio e propagação espacial de uma parreira contaminada sobre uma plantação de parreiras sadias e sua posterior recuperação atuando como barreira de contenção. A simulação foi executada ao longo de 50 ciclos temporais, modelando as transições de estado, a mecânica da vizinhança espacial de Moore e o impacto do tempo de recuperação das parreiras na formação da barreira. Os resultados incluem a análise quantitativa da curva epidemiológica, verificação automatizada por testes unitários e relatórios em formato .txt adaptados para acessibilidade via leitores de tela.</w:t>
+        <w:t xml:space="preserve">As pragas agrícolas e doenças fúngicas em vinhedos representam um dos desafios mais complexos para a viticultura contemporânea. A modelagem computacional in silico tem se consolidado como uma ferramenta essencial para a compreensão dos mecanismos de disseminação fitopatogênica e da contenção espacial de surtos em cultivos perenes. Este trabalho apresenta o desenvolvimento de um modelo computacional baseado em Autômatos Celulares (AC), implementado na linguagem Python e validado por Desenvolvimento Orientado a Testes (TDD com Pytest), para analisar a dinâmica de contágio e propagação espacial de uma parreira contaminada sobre uma população de parreiras sadias, bem como sua posterior recuperação atuando como barreira de contenção. A simulação foi executada ao longo de 50 ciclos temporais, modelando as transições de estado, a mecânica da vizinhança espacial de Moore e o impacto do tempo de recuperação das parreiras na proteção do vinhedo. Os resultados incluem a análise quantitativa da curva epidemiológica, suíte de testes automatizados e relatórios em formato .txt adaptados para acessibilidade via leitores de tela.</w:t>
       </w:r>
     </w:p>
     <w:p>
@@ -224,7 +224,7 @@
           <w:rtl w:val="0"/>
         </w:rPr>
         <w:tab/>
-        <w:t xml:space="preserve">A disseminação de fitopatógenos e a progressão de pragas em plantações de uvas (Vitis vinifera) envolvem processos biológicos e espaciais altamente complexos, nos quais parreiras contaminadas interagem diretamente com o microambiente e com as videiras ao seu redor. O estudo da dinâmica espacial de contaminação entre parreiras próximas fornece insights valiosos sobre como focos locais de infecção se propagam e afetam o parreiral como um todo.</w:t>
+        <w:t xml:space="preserve">A patogênese e a progressão de pragas e doenças fúngicas em plantações de uvas envolvem processos biológicos e espaciais altamente complexos, nos quais parreiras contaminadas interagem diretamente com o microambiente e com as videiras próximas ao seu redor. O estudo da dinâmica espacial de contaminação no parreiral fornece informações valiosas sobre como os focos iniciais de infecção se propagam para as plantas adjacentes e afetam a plantação como um todo.</w:t>
       </w:r>
     </w:p>
     <w:p>
@@ -239,7 +239,7 @@
           <w:rtl w:val="0"/>
         </w:rPr>
         <w:tab/>
-        <w:t xml:space="preserve">Nesse contexto, os Autômatos Celulares (AC) constituem um arcabouço matemático e computacional discreto ideal para simular sistemas agrícolas em que regras locais determinam o comportamento emergente global. O objetivo deste trabalho é formalizar um modelo de AC capaz de simular a mecânica de contágio entre parreiras contaminadas e sadias, avaliando o papel do raio de vizinhança, das taxas de propagação e da formação de recuperação fitossanitária atuando como barreira de contenção contra o avanço da praga na plantação.</w:t>
+        <w:t xml:space="preserve">Nesse contexto, os Autômatos Celulares (AC) constituem um arcabouço matemático e computacional discreto ideal para simular sistemas agrícolas em que regras locais de proximidade determinam o comportamento emergente global. O objetivo deste trabalho é formalizar um modelo de AC em Python capaz de simular a mecânica de contágio entre parreiras contaminadas e sadias, avaliando o papel do raio de vizinhança de Moore, das taxas de propagação, da validação automatizada via TDD com Pytest e da recuperação das parreiras, que passam a atuar como barreira de contenção contra o avanço da praga.</w:t>
       </w:r>
     </w:p>
     <w:p>
@@ -280,7 +280,7 @@
           <w:rtl w:val="0"/>
         </w:rPr>
         <w:tab/>
-        <w:t xml:space="preserve">O modelo foi construído em Python seguindo práticas de Desenvolvimento Orientado a Testes (TDD com o framework Pytest) e utiliza matrizes bidimensionais (biblioteca NumPy e visualização com Matplotlib/Tkinter) para representar a estrutura espacial da plantação de uvas. A grade espacial é definida como um reticulado discreto de dimensões 50 x 50.</w:t>
+        <w:t xml:space="preserve">O modelo foi construído em Python e utiliza matrizes bidimensionais para representar a estrutura espacial da plantação de uvas, contando com verificação automatizada de regras por meio do framework Pytest (TDD). A grade espacial é definida como um reticulado discreto de dimensões 50 por 50.</w:t>
       </w:r>
     </w:p>
     <w:p>
@@ -295,7 +295,7 @@
           <w:rtl w:val="0"/>
         </w:rPr>
         <w:tab/>
-        <w:t xml:space="preserve">A grade abriga um total de 2.500 células (parreiras de uva). Cada parreira localizada na posição (i, j) no instante de tempo t possui um estado E(i, j, t) pertencente a {S, I, R}, baseado em uma adaptação do modelo epidemiológico SIR:</w:t>
+        <w:t xml:space="preserve">A grade abriga um total de 2.500 células (parreiras). Cada parreira localizada na posição (i, j) no instante de tempo t possui um estado E(i, j, t) pertencente ao conjunto {S, I, R}, baseado em uma adaptação do modelo epidemiológico SIR:</w:t>
       </w:r>
     </w:p>
     <w:p>
@@ -317,7 +317,7 @@
         <w:rPr>
           <w:rtl w:val="0"/>
         </w:rPr>
-        <w:t xml:space="preserve">Saudável / Suscetível (S): Parreira sadia, produtiva e suscetível à contaminação induzida por parreiras adjacentes infectadas na vizinhança de Moore. Representada graficamente pelo caractere . no relatório impresso.</w:t>
+        <w:t xml:space="preserve">Saudável / Suscetível (S): Parreira sadia, produtiva e suscetível à contaminação induzida por parreiras próximas infectadas. Representada graficamente pelo caractere . no relatório impresso.</w:t>
       </w:r>
     </w:p>
     <w:p>
@@ -339,7 +339,7 @@
         <w:rPr>
           <w:rtl w:val="0"/>
         </w:rPr>
-        <w:t xml:space="preserve">Contaminada / Infectada (I): Parreira infectada que expressa o vetor de contágio, capaz de transmitir a praga para as parreiras vizinhas próximas durante seu ciclo infeccioso. Representada pelo caractere X.</w:t>
+        <w:t xml:space="preserve">Contaminada / Infectada (I): Parreira infectada que expressa o vetor de contágio, capaz de transmitir a praga para suas vizinhas diretas na vizinhança de Moore. Representada pelo caractere X.</w:t>
       </w:r>
     </w:p>
     <w:p>
@@ -361,7 +361,7 @@
         <w:rPr>
           <w:rtl w:val="0"/>
         </w:rPr>
-        <w:t xml:space="preserve">Recuperada / Barreira de Contenção (R): Parreira que completou seu período infeccioso e recuperou-se, tornando-se imune e atuando como barreira mecânica e biológica de contenção que bloqueia o avanço da contaminação. Representada pelo caractere O.</w:t>
+        <w:t xml:space="preserve">Recuperada / Barreira de Contenção (R): Parreira que completou seu período infeccioso e se recuperou, tornando-se imune e atuando como barreira mecânica e biológica de contenção que impede a passagem da infecção para as parreiras sadias adjacentes. Representada pelo caractere O.</w:t>
       </w:r>
     </w:p>
     <w:p>
@@ -402,7 +402,7 @@
           <w:rtl w:val="0"/>
         </w:rPr>
         <w:tab/>
-        <w:t xml:space="preserve">Para avaliar a estabilidade do modelo computacional, a invariância das regras verificadas via TDD (Pytest) e a dinâmica de propagação do contágio e formação de barreira na plantação de uvas, foram executadas três replicações independentes da simulação sob as mesmas condições iniciais, durante um horizonte temporal fixado em T = 50 ciclos.</w:t>
+        <w:t xml:space="preserve">Para avaliar a estabilidade do modelo computacional, a exatidão das regras verificadas pelos testes em TDD (Pytest) e a dinâmica de propagação do contágio na grade celular da plantação de uvas, foram executadas três replicações independentes da simulação sob as mesmas condições iniciais, durante um horizonte temporal fixado em T = 50 ciclos.</w:t>
       </w:r>
     </w:p>
     <w:p>
@@ -431,7 +431,7 @@
         <w:rPr>
           <w:rtl w:val="0"/>
         </w:rPr>
-        <w:t xml:space="preserve">Encerramento do surto: Em todas as simulações, o ciclo epidemiológico atingiu a extinção (ausência de novas parreiras na condição Contaminada) entre os ciclos 21 e 24.</w:t>
+        <w:t xml:space="preserve">Encerramento do surto: Em todas as simulações, o ciclo epidemiológico atingiu a extinção (ausência de novas parreiras na condição Contaminada) entre os ciclos 21 e 24, consolidando a barreira de contenção.</w:t>
       </w:r>
     </w:p>
     <w:p>
@@ -1041,7 +1041,7 @@
           <w:rtl w:val="0"/>
         </w:rPr>
         <w:tab/>
-        <w:t xml:space="preserve">A interrupção da contaminação — ocorrida na primeira metade do tempo total estipulado — evidencia o papel determinante da taxa de transição para o estado Recuperada / Barreira de Contenção (R) e da vizinhança espacial. As parreiras que transitaram para o estado R passaram a atuar como barreiras físicas e topológicas no reticulado discreto da plantação, bloqueando as vias de contágio das parreiras no estado Contaminada (I) e impedindo a infecção total da população de parreiras Suscetíveis (S).</w:t>
+        <w:t xml:space="preserve">A interrupção da contaminação — ocorrida na primeira metade do tempo total estipulado — evidencia o papel determinante da taxa de transição para o estado Recuperada / Barreira de Contenção (R) e da vizinhança mecânica de Moore. As parreiras que transitaram para o estado R passaram a atuar como barreiras físicas e topológicas no reticulado discreto, bloqueando as vias de contágio das parreiras no estado Contaminada (I) e impedindo a infecção total da população de parreiras Suscetíveis (S). Esse comportamento também foi comprovado deterministicamente pela suíte de testes automatizados em Pytest, na qual um anel fechado de parreiras recuperadas isola integralmente um foco central de infecção.</w:t>
       </w:r>
     </w:p>
     <w:p>
@@ -1081,7 +1081,7 @@
         <w:rPr>
           <w:rtl w:val="0"/>
         </w:rPr>
-        <w:t xml:space="preserve">O modelo desenvolvido em Python e validado por testes automatizados em TDD (Pytest) demonstrou eficácia ao representar a dinâmica de contaminação entre parreiras de uva e sua posterior recuperação atuando como barreira de contenção por meio da abordagem de Autômatos Celulares baseada na topologia de Moore. A consistência observada nas replicações experimentais confirma que a transição para o estado recuperado/barreira limita significativamente a expansão da praga no vinhedo, delimitando a duração da fase infecciosa ao intervalo entre 21 e 24 ciclos.</w:t>
+        <w:t xml:space="preserve">O modelo desenvolvido em Python demonstrou eficácia ao representar a dinâmica de contaminação entre parreiras próximas e sua posterior recuperação atuando como barreira de contenção por meio da abordagem de Autômatos Celulares baseada na topologia de Moore. A consistência observada nas replicações experimentais e nos testes automatizados via TDD (Pytest) confirma que a transição para o estado recuperado limita significativamente a expansão da praga na plantação de uvas, delimitando a duração da fase infecciosa ao intervalo entre 21 e 24 ciclos.</w:t>
       </w:r>
     </w:p>
     <w:p>
@@ -1095,7 +1095,7 @@
         <w:rPr>
           <w:rtl w:val="0"/>
         </w:rPr>
-        <w:t xml:space="preserve">Além do aporte teórico-computacional e da visualização gráfica, a geração de relatórios descritivos e matriciais em formato de texto simples (.txt) assegura a acessibilidade do software a leitores de tela, promovendo o uso inclusivo da ferramenta. Trabalhos futuros poderão explorar a influência da direção do vento entre as fileiras do parreiral e diferentes estratégias de manejo fitossanitário preventivo.</w:t>
+        <w:t xml:space="preserve">Além do aporte teórico-computacional e dos gráficos gerados, a emissão de relatórios tabulares e descritivos em formato de texto simples (.txt) assegura a acessibilidade do software a leitores de tela, promovendo o uso inclusivo da ferramenta. Trabalhos futuros poderão explorar a variação probabilística induzida pela ação do vento entre as fileiras do vinhedo e diferentes protocolos de manejo preventivo.</w:t>
       </w:r>
     </w:p>
     <w:p>

</xml_diff>

<commit_message>
docs: fundamenta artigo nos 4 trabalhos da pasta C:\altomatos (Correia et al., Nascimento e Mariano, Peixoto, Rodrigues)
</commit_message>
<xml_diff>
--- a/Simulação da Propagação em Plantação de Uvas por Autômatos Celulares em Ambiente Python.docx
+++ b/Simulação da Propagação em Plantação de Uvas por Autômatos Celulares em Ambiente Python.docx
@@ -26,7 +26,7 @@
           <w:szCs w:val="32"/>
           <w:rtl w:val="0"/>
         </w:rPr>
-        <w:t xml:space="preserve">Simulação da Propagação de Pragas e Barreira de Contenção em Plantação de Uvas por Autômatos Celulares em Ambiente Python</w:t>
+        <w:t xml:space="preserve">Simulação da Propagação de Fitopatógenos e Barreira de Contenção em Plantação de Uvas por Autômatos Celulares Probabilísticos em Ambiente Python</w:t>
       </w:r>
     </w:p>
     <w:p>
@@ -183,7 +183,7 @@
           <w:rFonts w:ascii="Times" w:cs="Times" w:eastAsia="Times" w:hAnsi="Times"/>
           <w:i w:val="1"/>
         </w:rPr>
-        <w:t xml:space="preserve">As pragas agrícolas e doenças fúngicas em vinhedos representam um dos desafios mais complexos para a viticultura contemporânea. A modelagem computacional in silico tem se consolidado como uma ferramenta essencial para a compreensão dos mecanismos de disseminação fitopatogênica e da contenção espacial de surtos em cultivos perenes. Este trabalho apresenta o desenvolvimento de um modelo computacional baseado em Autômatos Celulares (AC), implementado na linguagem Python e validado por Desenvolvimento Orientado a Testes (TDD com Pytest), para analisar a dinâmica de contágio e propagação espacial de uma parreira contaminada sobre uma população de parreiras sadias, bem como sua posterior recuperação atuando como barreira de contenção. A simulação foi executada ao longo de 50 ciclos temporais, modelando as transições de estado, a mecânica da vizinhança espacial de Moore e o impacto do tempo de recuperação das parreiras na proteção do vinhedo. Os resultados incluem a análise quantitativa da curva epidemiológica, suíte de testes automatizados e relatórios em formato .txt adaptados para acessibilidade via leitores de tela.</w:t>
+        <w:t xml:space="preserve">O Brasil destaca-se na produção mundial de uvas de mesa, concentrando na região Nordeste quase a totalidade das exportações nacionais, sobretudo no Vale do São Francisco. Todavia, enfermidades fitossanitárias como o declínio da videira associado a fungos fitopatogênicos (Correia et al., 2011) e o cancro bacteriano causado por Xanthomonas campestris pv. viticola (Nascimento; Mariano, 2004) representam severos desafios à viticultura. Este trabalho apresenta o desenvolvimento de um modelo computacional baseado em Autômatos Celulares Probabilísticos (Peixoto, 2005; Rodrigues, 2011), implementado em Python e validado por Desenvolvimento Orientado a Testes (TDD com Pytest), para analisar a transmissão horizontal por contágio a partir de parreiras contaminadas sobre parreiras próximas e sua posterior recuperação atuando como barreira de contenção fitossanitária. A simulação foi executada ao longo de 50 ciclos temporais em uma grade de 50 por 50 parreiras, modelando a vizinhança de Moore e o bloqueio espacial promovido pelo manejo protetor. Os resultados incluem a análise da curva epidemiológica, validação automatizada por testes unitários e relatórios em formato .txt adaptados para acessibilidade via leitores de tela.</w:t>
       </w:r>
     </w:p>
     <w:p>
@@ -224,7 +224,7 @@
           <w:rtl w:val="0"/>
         </w:rPr>
         <w:tab/>
-        <w:t xml:space="preserve">A patogênese e a progressão de pragas e doenças fúngicas em plantações de uvas envolvem processos biológicos e espaciais altamente complexos, nos quais parreiras contaminadas interagem diretamente com o microambiente e com as videiras próximas ao seu redor. O estudo da dinâmica espacial de contaminação no parreiral fornece informações valiosas sobre como os focos iniciais de infecção se propagam para as plantas adjacentes e afetam a plantação como um todo.</w:t>
+        <w:t xml:space="preserve">A viticultura possui expressiva relevância socioeconômica no Brasil, especialmente nos polos irrigados do Nordeste, como o Vale do São Francisco e o Vale do Siriji em Pernambuco e o Vale do Assú no Rio Grande do Norte, responsáveis por cerca de 99% da exportação brasileira de uvas de mesa (Correia et al., 2011). Entretanto, a intensificação do cultivo de videira (Vitis vinifera) em áreas contínuas favorece a disseminação de fitopatógenos severos, a exemplo do complexo de fungos causadores do declínio da videira, como Lasiodiplodia theobromae (Correia et al., 2011), e do cancro bacteriano causado por Xanthomonas campestris pv. viticola, cuja transmissão dentro do parreiral ocorre rapidamente entre plantas próximas por respingos de chuva, irrigação e tratos culturais (Nascimento; Mariano, 2004).</w:t>
       </w:r>
     </w:p>
     <w:p>
@@ -239,7 +239,7 @@
           <w:rtl w:val="0"/>
         </w:rPr>
         <w:tab/>
-        <w:t xml:space="preserve">Nesse contexto, os Autômatos Celulares (AC) constituem um arcabouço matemático e computacional discreto ideal para simular sistemas agrícolas em que regras locais de proximidade determinam o comportamento emergente global. O objetivo deste trabalho é formalizar um modelo de AC em Python capaz de simular a mecânica de contágio entre parreiras contaminadas e sadias, avaliando o papel do raio de vizinhança de Moore, das taxas de propagação, da validação automatizada via TDD com Pytest e da recuperação das parreiras, que passam a atuar como barreira de contenção contra o avanço da praga.</w:t>
+        <w:t xml:space="preserve">Para investigar o avanço espaço-temporal de epidemias agrícolas em pomares e talhões, os Autômatos Celulares (AC) constituem um arcabouço discreto no tempo, no espaço e no estado altamente eficaz, no qual cada planta é representada por um sítio do reticulado cujas interações locais determinam o padrão macroscópico emergente (Peixoto, 2005). Sob a ótica da transmissão horizontal por contágio em redes bidimensionais, os Autômatos Celulares Probabilísticos permitem incorporar a estocasticidade inerente ao contato infeccioso entre hospedeiros vizinhos (Rodrigues, 2011). O objetivo deste trabalho é formalizar e testar via TDD (Pytest) um modelo de AC em Python capaz de simular a contaminação entre parreiras próximas e demonstrar como a recuperação das plantas tratadas passa a atuar como barreira física e biológica de contenção no vinhedo.</w:t>
       </w:r>
     </w:p>
     <w:p>
@@ -280,7 +280,7 @@
           <w:rtl w:val="0"/>
         </w:rPr>
         <w:tab/>
-        <w:t xml:space="preserve">O modelo foi construído em Python e utiliza matrizes bidimensionais para representar a estrutura espacial da plantação de uvas, contando com verificação automatizada de regras por meio do framework Pytest (TDD). A grade espacial é definida como um reticulado discreto de dimensões 50 por 50.</w:t>
+        <w:t xml:space="preserve">O modelo foi construído em Python utilizando matrizes bidimensionais (NumPy e Matplotlib/Tkinter) e verificado por testes unitários automatizados com Pytest. Seguindo a formulação espacial para talhões agrícolas descrita por Peixoto (2005) e a atualização síncrona em redes quadradas abordada por Rodrigues (2011), o parreiral é definido como um reticulado discreto de dimensões 50 por 50.</w:t>
       </w:r>
     </w:p>
     <w:p>
@@ -295,7 +295,7 @@
           <w:rtl w:val="0"/>
         </w:rPr>
         <w:tab/>
-        <w:t xml:space="preserve">A grade abriga um total de 2.500 células (parreiras). Cada parreira localizada na posição (i, j) no instante de tempo t possui um estado E(i, j, t) pertencente ao conjunto {S, I, R}, baseado em uma adaptação do modelo epidemiológico SIR:</w:t>
+        <w:t xml:space="preserve">A grade abriga um total de N = 2.500 células, onde cada sítio representa uma parreira localizada na posição (i, j) no instante discreto t com estado E(i, j, t) pertencente ao conjunto {S, I, R}, adaptado do modelo epidemiológico espacial SIR:</w:t>
       </w:r>
     </w:p>
     <w:p>
@@ -317,7 +317,7 @@
         <w:rPr>
           <w:rtl w:val="0"/>
         </w:rPr>
-        <w:t xml:space="preserve">Saudável / Suscetível (S): Parreira sadia, produtiva e suscetível à contaminação induzida por parreiras próximas infectadas. Representada graficamente pelo caractere . no relatório impresso.</w:t>
+        <w:t xml:space="preserve">Saudável / Suscetível (S): Parreira sadia, produtiva e vulnerável à transmissão horizontal por contágio a partir de parreiras adjacentes infectadas na vizinhança de Moore (8 vizinhos mais próximos de raio 1, conforme Peixoto, 2005). Representada graficamente pelo caractere . no relatório impresso.</w:t>
       </w:r>
     </w:p>
     <w:p>
@@ -339,7 +339,7 @@
         <w:rPr>
           <w:rtl w:val="0"/>
         </w:rPr>
-        <w:t xml:space="preserve">Contaminada / Infectada (I): Parreira infectada que expressa o vetor de contágio, capaz de transmitir a praga para suas vizinhas diretas na vizinhança de Moore. Representada pelo caractere X.</w:t>
+        <w:t xml:space="preserve">Contaminada / Infectada (I): Parreira colonizada pelo patógeno (como X. campestris pv. viticola ou fungos de declínio) que transmite a infecção horizontalmente para suas vizinhas próximas com probabilidade p durante seu ciclo infeccioso (Rodrigues, 2011). Representada pelo caractere X.</w:t>
       </w:r>
     </w:p>
     <w:p>
@@ -361,7 +361,7 @@
         <w:rPr>
           <w:rtl w:val="0"/>
         </w:rPr>
-        <w:t xml:space="preserve">Recuperada / Barreira de Contenção (R): Parreira que completou seu período infeccioso e se recuperou, tornando-se imune e atuando como barreira mecânica e biológica de contenção que impede a passagem da infecção para as parreiras sadias adjacentes. Representada pelo caractere O.</w:t>
+        <w:t xml:space="preserve">Recuperada / Barreira de Contenção (R): Parreira que, após o período infeccioso (T_rec = 3 ciclos), passou por intervenção fitossanitária recomendada pela literatura — tal como poda drástica de ramos sintomáticos, pincelamento de cortes com pasta cúprica e aplicação de fungicidas cúpricos ou tiocarbamatos que formam uma película protetora bacteriostática no filoplano, associada a barreiras quebra-vento (Nascimento; Mariano, 2004). No autômato, essa parreira recuperada torna-se imune e atua como barreira mecânica e biológica de contenção, bloqueando a passagem do contágio para as parreiras saudáveis adjacentes. Representada pelo caractere O.</w:t>
       </w:r>
     </w:p>
     <w:p>
@@ -402,7 +402,7 @@
           <w:rtl w:val="0"/>
         </w:rPr>
         <w:tab/>
-        <w:t xml:space="preserve">Para avaliar a estabilidade do modelo computacional, a exatidão das regras verificadas pelos testes em TDD (Pytest) e a dinâmica de propagação do contágio na grade celular da plantação de uvas, foram executadas três replicações independentes da simulação sob as mesmas condições iniciais, durante um horizonte temporal fixado em T = 50 ciclos.</w:t>
+        <w:t xml:space="preserve">Para avaliar a estabilidade do modelo computacional, a consistência das regras locais validadas via TDD (Pytest) e a dinâmica de transmissão horizontal e contenção na grade de 2.500 parreiras, foram executadas três replicações independentes da simulação sob as mesmas condições iniciais (1% de focos primários, p = 0,35 e T_rec = 3), durante um horizonte temporal fixado em T = 50 ciclos.</w:t>
       </w:r>
     </w:p>
     <w:p>
@@ -417,7 +417,7 @@
           <w:rtl w:val="0"/>
         </w:rPr>
         <w:tab/>
-        <w:t xml:space="preserve">Os dados empíricos obtidos revelaram uma convergência no comportamento dinâmico do sistema:</w:t>
+        <w:t xml:space="preserve">Os dados empíricos obtidos revelaram uma convergência para o estado livre de doença (extinção da fase infectada I = 0, conforme Rodrigues, 2011) com preservação de parreiras sadias:</w:t>
       </w:r>
     </w:p>
     <w:p>
@@ -431,7 +431,7 @@
         <w:rPr>
           <w:rtl w:val="0"/>
         </w:rPr>
-        <w:t xml:space="preserve">Encerramento do surto: Em todas as simulações, o ciclo epidemiológico atingiu a extinção (ausência de novas parreiras na condição Contaminada) entre os ciclos 21 e 24, consolidando a barreira de contenção.</w:t>
+        <w:t xml:space="preserve">Encerramento do surto: Em todas as simulações, o ciclo epidemiológico atingiu a extinção (ausência de novas parreiras na condição Contaminada) entre os ciclos 21 e 24, comprovando a contenção espacial.</w:t>
       </w:r>
     </w:p>
     <w:p>
@@ -1041,7 +1041,7 @@
           <w:rtl w:val="0"/>
         </w:rPr>
         <w:tab/>
-        <w:t xml:space="preserve">A interrupção da contaminação — ocorrida na primeira metade do tempo total estipulado — evidencia o papel determinante da taxa de transição para o estado Recuperada / Barreira de Contenção (R) e da vizinhança mecânica de Moore. As parreiras que transitaram para o estado R passaram a atuar como barreiras físicas e topológicas no reticulado discreto, bloqueando as vias de contágio das parreiras no estado Contaminada (I) e impedindo a infecção total da população de parreiras Suscetíveis (S). Esse comportamento também foi comprovado deterministicamente pela suíte de testes automatizados em Pytest, na qual um anel fechado de parreiras recuperadas isola integralmente um foco central de infecção.</w:t>
+        <w:t xml:space="preserve">A interrupção da transmissão horizontal — ocorrida antes da metade do horizonte temporal estipulado — evidencia o papel determinante da transição para o estado Recuperada / Barreira de Contenção (R) combinada à topologia de Moore (Peixoto, 2005). Conforme preconizado no manejo integrado da videira por Nascimento e Mariano (2004), a detecção precoce dos focos iniciais seguida pela proteção química cúprica e isolamento cultural impede que o patógeno alcance a totalidade do pomar. No reticulado discreto, as parreiras que transitaram para o estado R formaram cinturões protetores que encapsularam as manchas de infecção (I), preservando entre 341 e 388 parreiras Suscetíveis (S) livres de contaminação.</w:t>
       </w:r>
     </w:p>
     <w:p>
@@ -1081,7 +1081,8 @@
         <w:rPr>
           <w:rtl w:val="0"/>
         </w:rPr>
-        <w:t xml:space="preserve">O modelo desenvolvido em Python demonstrou eficácia ao representar a dinâmica de contaminação entre parreiras próximas e sua posterior recuperação atuando como barreira de contenção por meio da abordagem de Autômatos Celulares baseada na topologia de Moore. A consistência observada nas replicações experimentais e nos testes automatizados via TDD (Pytest) confirma que a transição para o estado recuperado limita significativamente a expansão da praga na plantação de uvas, delimitando a duração da fase infecciosa ao intervalo entre 21 e 24 ciclos.</w:t>
+        <w:tab/>
+        <w:t xml:space="preserve">O modelo desenvolvido em Python e validado por testes automatizados em TDD (Pytest) demonstrou eficácia ao representar a dinâmica espacial de contaminação horizontal em plantações de uvas e a formação de barreiras de contenção por parreiras recuperadas. Em consonância com os estudos fitopatológicos de Correia et al. (2011) e Nascimento e Mariano (2004), bem como com a teoria de Autômatos Celulares aplicada a sistemas agrícolas e epidemiológicos (Peixoto, 2005; Rodrigues, 2011), verificou-se que a rápida recuperação e proteção das plantas ao redor dos focos limita a duração do surto ao intervalo entre 21 e 24 ciclos.</w:t>
       </w:r>
     </w:p>
     <w:p>
@@ -1095,7 +1096,8 @@
         <w:rPr>
           <w:rtl w:val="0"/>
         </w:rPr>
-        <w:t xml:space="preserve">Além do aporte teórico-computacional e dos gráficos gerados, a emissão de relatórios tabulares e descritivos em formato de texto simples (.txt) assegura a acessibilidade do software a leitores de tela, promovendo o uso inclusivo da ferramenta. Trabalhos futuros poderão explorar a variação probabilística induzida pela ação do vento entre as fileiras do vinhedo e diferentes protocolos de manejo preventivo.</w:t>
+        <w:tab/>
+        <w:t xml:space="preserve">Adicionalmente, a geração automatizada de relatórios descritivos e matrizes visuais em formato de texto simples (.txt) assegura a plena acessibilidade do software a leitores de tela, promovendo a inclusão científica. Trabalhos futuros poderão incorporar controladores baseados em lógica fuzzy para modelar a influência da velocidade e direção dos ventos na dispersão não-local do patógeno entre fileiras do parreiral, à semelhança da abordagem proposta por Peixoto (2005).</w:t>
       </w:r>
     </w:p>
     <w:p>
@@ -1111,6 +1113,92 @@
         <w:rPr>
           <w:rtl w:val="0"/>
         </w:rPr>
+      </w:r>
+    </w:p>
+    <w:p>
+      <w:pPr>
+        <w:pStyle w:val="Heading2"/>
+        <w:tabs>
+          <w:tab w:val="left" w:leader="none" w:pos="720"/>
+        </w:tabs>
+        <w:spacing w:after="0" w:before="240" w:line="240" w:lineRule="auto"/>
+        <w:jc w:val="left"/>
+        <w:rPr>
+          <w:rFonts w:ascii="Times" w:cs="Times" w:eastAsia="Times" w:hAnsi="Times"/>
+          <w:sz w:val="26"/>
+          <w:szCs w:val="26"/>
+        </w:rPr>
+      </w:pPr>
+      <w:bookmarkStart w:colFirst="0" w:colLast="0" w:name="_qxinv237njgf" w:id="4"/>
+      <w:bookmarkEnd w:id="4"/>
+      <w:r>
+        <w:rPr>
+          <w:rFonts w:ascii="Times" w:cs="Times" w:eastAsia="Times" w:hAnsi="Times"/>
+          <w:sz w:val="26"/>
+          <w:szCs w:val="26"/>
+          <w:rtl w:val="0"/>
+        </w:rPr>
+        <w:t xml:space="preserve">5. Referências</w:t>
+      </w:r>
+    </w:p>
+    <w:p>
+      <w:pPr>
+        <w:tabs>
+          <w:tab w:val="left" w:leader="none" w:pos="720"/>
+        </w:tabs>
+        <w:rPr/>
+      </w:pPr>
+      <w:r>
+        <w:rPr>
+          <w:rtl w:val="0"/>
+        </w:rPr>
+        <w:tab/>
+        <w:t xml:space="preserve">CORREIA, K. C.; CÂMARA, M. P. S.; BARBOSA, M. A. G.; SALES JR., R.; AGUSTÍ-BRISACH, C.; GRAMAJE, D.; GARCÍA-JIMÉNEZ, J.; ABAD-CAMPOS, P.; ARMENGOL, J.; MICHEREFF, S. J. Fungos associados ao declínio da videira no Nordeste do Brasil. Tropical Plant Pathology, v. 36, Suplemento, p. 909, 2011.</w:t>
+      </w:r>
+    </w:p>
+    <w:p>
+      <w:pPr>
+        <w:tabs>
+          <w:tab w:val="left" w:leader="none" w:pos="720"/>
+        </w:tabs>
+        <w:rPr/>
+      </w:pPr>
+      <w:r>
+        <w:rPr>
+          <w:rtl w:val="0"/>
+        </w:rPr>
+        <w:tab/>
+        <w:t xml:space="preserve">NASCIMENTO, A. R. P.; MARIANO, R. L. R. Cancro bacteriano da videira: etiologia, epidemiologia e medidas de controle. Ciência Rural, Santa Maria, v. 34, n. 1, p. 301-307, jan.-fev. 2004.</w:t>
+      </w:r>
+    </w:p>
+    <w:p>
+      <w:pPr>
+        <w:tabs>
+          <w:tab w:val="left" w:leader="none" w:pos="720"/>
+        </w:tabs>
+        <w:rPr/>
+      </w:pPr>
+      <w:r>
+        <w:rPr>
+          <w:rtl w:val="0"/>
+        </w:rPr>
+        <w:tab/>
+        <w:t xml:space="preserve">PEIXOTO, M. S. Sistemas Dinâmicos e Controladores Fuzzy: um Estudo da Dispersão da Morte Súbita dos Citros em São Paulo. 2005. 189 f. Tese (Doutorado em Matemática Aplicada) – Instituto de Matemática, Estatística e Computação Científica, Universidade Estadual de Campinas (UNICAMP), Campinas, 2005.</w:t>
+      </w:r>
+    </w:p>
+    <w:p>
+      <w:pPr>
+        <w:tabs>
+          <w:tab w:val="left" w:leader="none" w:pos="720"/>
+        </w:tabs>
+        <w:rPr/>
+      </w:pPr>
+      <w:r>
+        <w:rPr>
+          <w:rtl w:val="0"/>
+        </w:rPr>
+        <w:tab/>
+        <w:t xml:space="preserve">RODRIGUES, L. L. F. Transmissão vertical e horizontal de parasitas usando autômatos celulares probabilísticos. 2011. 68 f. Dissertação (Mestrado em Física) – Centro de Ciências Exatas e da Natureza, Universidade Federal da Paraíba (UFPB), João Pessoa, 2011.</w:t>
       </w:r>
     </w:p>
     <w:sectPr>

</xml_diff>